<commit_message>
Agregar analisis estatico SonarQube al informe EP3 (vulnerabilidad blocker, hotspots, code smells)
</commit_message>
<xml_diff>
--- a/EP3 - Informe de Certificacion - Atlas.docx
+++ b/EP3 - Informe de Certificacion - Atlas.docx
@@ -862,7 +862,7 @@
                 <w:rFonts w:ascii="Arial" w:hAnsi="Arial"/>
                 <w:sz w:val="20"/>
               </w:rPr>
-              <w:t>10 (3 Críticos · 4 Mayores · 2 Menores · 1 Observación)</w:t>
+              <w:t>11 (3 Críticos · 4 Mayores · 2 Menores · 2 Observaciones)</w:t>
             </w:r>
           </w:p>
         </w:tc>
@@ -941,6 +941,45 @@
                 <w:sz w:val="20"/>
               </w:rPr>
               <w:t>14 (frontend 11 + backend 3)</w:t>
+            </w:r>
+          </w:p>
+        </w:tc>
+      </w:tr>
+      <w:tr>
+        <w:tc>
+          <w:tcPr>
+            <w:tcW w:type="dxa" w:w="4320"/>
+          </w:tcPr>
+          <w:p>
+            <w:pPr>
+              <w:spacing w:line="240" w:lineRule="auto"/>
+            </w:pPr>
+            <w:r/>
+            <w:r>
+              <w:rPr>
+                <w:rFonts w:ascii="Arial" w:hAnsi="Arial"/>
+                <w:b/>
+                <w:sz w:val="20"/>
+              </w:rPr>
+              <w:t>Resultados análisis estático (SonarQube)</w:t>
+            </w:r>
+          </w:p>
+        </w:tc>
+        <w:tc>
+          <w:tcPr>
+            <w:tcW w:type="dxa" w:w="4320"/>
+          </w:tcPr>
+          <w:p>
+            <w:pPr>
+              <w:spacing w:line="240" w:lineRule="auto"/>
+            </w:pPr>
+            <w:r/>
+            <w:r>
+              <w:rPr>
+                <w:rFonts w:ascii="Arial" w:hAnsi="Arial"/>
+                <w:sz w:val="20"/>
+              </w:rPr>
+              <w:t>1 vulnerabilidad BLOCKER · 4 security hotspots · 198 code smells · 1 bug</w:t>
             </w:r>
           </w:p>
         </w:tc>
@@ -2264,6 +2303,116 @@
                 <w:sz w:val="20"/>
               </w:rPr>
               <w:t>FN-02 (4,06 s)</w:t>
+            </w:r>
+          </w:p>
+        </w:tc>
+      </w:tr>
+      <w:tr>
+        <w:tc>
+          <w:tcPr>
+            <w:tcW w:type="dxa" w:w="1440"/>
+          </w:tcPr>
+          <w:p>
+            <w:pPr>
+              <w:spacing w:line="240" w:lineRule="auto"/>
+            </w:pPr>
+            <w:r/>
+            <w:r>
+              <w:rPr>
+                <w:rFonts w:ascii="Arial" w:hAnsi="Arial"/>
+                <w:sz w:val="20"/>
+              </w:rPr>
+              <w:t>BUG-011</w:t>
+            </w:r>
+          </w:p>
+        </w:tc>
+        <w:tc>
+          <w:tcPr>
+            <w:tcW w:type="dxa" w:w="1440"/>
+          </w:tcPr>
+          <w:p>
+            <w:pPr>
+              <w:spacing w:line="240" w:lineRule="auto"/>
+            </w:pPr>
+            <w:r/>
+            <w:r>
+              <w:rPr>
+                <w:rFonts w:ascii="Arial" w:hAnsi="Arial"/>
+                <w:sz w:val="20"/>
+              </w:rPr>
+              <w:t>**Observación**</w:t>
+            </w:r>
+          </w:p>
+        </w:tc>
+        <w:tc>
+          <w:tcPr>
+            <w:tcW w:type="dxa" w:w="1440"/>
+          </w:tcPr>
+          <w:p>
+            <w:pPr>
+              <w:spacing w:line="240" w:lineRule="auto"/>
+            </w:pPr>
+            <w:r/>
+            <w:r>
+              <w:rPr>
+                <w:rFonts w:ascii="Arial" w:hAnsi="Arial"/>
+                <w:sz w:val="20"/>
+              </w:rPr>
+              <w:t>Deuda técnica</w:t>
+            </w:r>
+          </w:p>
+        </w:tc>
+        <w:tc>
+          <w:tcPr>
+            <w:tcW w:type="dxa" w:w="1440"/>
+          </w:tcPr>
+          <w:p>
+            <w:pPr>
+              <w:spacing w:line="240" w:lineRule="auto"/>
+            </w:pPr>
+            <w:r/>
+            <w:r>
+              <w:rPr>
+                <w:rFonts w:ascii="Arial" w:hAnsi="Arial"/>
+                <w:sz w:val="20"/>
+              </w:rPr>
+              <w:t>Credenciales de PostgreSQL en código (`db.js:6`). Detectado por SonarQube como vulnerabilidad **BLOCKER** `secrets:S6698` y confirma BUG-004</w:t>
+            </w:r>
+          </w:p>
+        </w:tc>
+        <w:tc>
+          <w:tcPr>
+            <w:tcW w:type="dxa" w:w="1440"/>
+          </w:tcPr>
+          <w:p>
+            <w:pPr>
+              <w:spacing w:line="240" w:lineRule="auto"/>
+            </w:pPr>
+            <w:r/>
+            <w:r>
+              <w:rPr>
+                <w:rFonts w:ascii="Arial" w:hAnsi="Arial"/>
+                <w:sz w:val="20"/>
+              </w:rPr>
+              <w:t>Abierto</w:t>
+            </w:r>
+          </w:p>
+        </w:tc>
+        <w:tc>
+          <w:tcPr>
+            <w:tcW w:type="dxa" w:w="1440"/>
+          </w:tcPr>
+          <w:p>
+            <w:pPr>
+              <w:spacing w:line="240" w:lineRule="auto"/>
+            </w:pPr>
+            <w:r/>
+            <w:r>
+              <w:rPr>
+                <w:rFonts w:ascii="Arial" w:hAnsi="Arial"/>
+                <w:sz w:val="20"/>
+              </w:rPr>
+              <w:t>Anexo E · SonarQube</w:t>
             </w:r>
           </w:p>
         </w:tc>
@@ -4455,6 +4604,36 @@
     </w:p>
     <w:p>
       <w:pPr>
+        <w:spacing w:line="240" w:lineRule="auto"/>
+        <w:jc w:val="center"/>
+      </w:pPr>
+      <w:r>
+        <w:rPr>
+          <w:rFonts w:ascii="Arial" w:hAnsi="Arial"/>
+          <w:b w:val="0"/>
+          <w:sz w:val="24"/>
+        </w:rPr>
+        <w:t xml:space="preserve">10. Configurar un </w:t>
+      </w:r>
+      <w:r>
+        <w:rPr>
+          <w:rFonts w:ascii="Arial" w:hAnsi="Arial"/>
+          <w:b/>
+          <w:sz w:val="24"/>
+        </w:rPr>
+        <w:t>Quality Gate de SonarQube</w:t>
+      </w:r>
+      <w:r>
+        <w:rPr>
+          <w:rFonts w:ascii="Arial" w:hAnsi="Arial"/>
+          <w:b w:val="0"/>
+          <w:sz w:val="24"/>
+        </w:rPr>
+        <w:t xml:space="preserve"> que incluya condiciones de seguridad (0 vulnerabilidades BLOCKER/CRITICAL, security rating A) y deuda &lt; 5 %, para que la certificación dependa de la herramienta en CI.</w:t>
+      </w:r>
+    </w:p>
+    <w:p>
+      <w:pPr>
         <w:spacing w:before="600"/>
         <w:jc w:val="center"/>
       </w:pPr>
@@ -9263,6 +9442,1252 @@
           <w:b w:val="0"/>
           <w:sz w:val="12"/>
         </w:rPr>
+      </w:r>
+    </w:p>
+    <w:p>
+      <w:pPr>
+        <w:spacing w:before="600"/>
+        <w:jc w:val="center"/>
+      </w:pPr>
+      <w:r>
+        <w:rPr>
+          <w:rFonts w:ascii="Arial" w:hAnsi="Arial"/>
+          <w:b/>
+          <w:sz w:val="28"/>
+        </w:rPr>
+        <w:t>Anexo E · Análisis estático con SonarQube (servidor local :9000)</w:t>
+      </w:r>
+    </w:p>
+    <w:p>
+      <w:pPr>
+        <w:spacing w:line="240" w:lineRule="auto"/>
+        <w:jc w:val="center"/>
+      </w:pPr>
+      <w:r>
+        <w:rPr>
+          <w:rFonts w:ascii="Arial" w:hAnsi="Arial"/>
+          <w:b w:val="0"/>
+          <w:sz w:val="24"/>
+        </w:rPr>
+        <w:t xml:space="preserve">Se desplegó un servidor </w:t>
+      </w:r>
+      <w:r>
+        <w:rPr>
+          <w:rFonts w:ascii="Arial" w:hAnsi="Arial"/>
+          <w:b/>
+          <w:sz w:val="24"/>
+        </w:rPr>
+        <w:t>SonarQube 10.6 Community</w:t>
+      </w:r>
+      <w:r>
+        <w:rPr>
+          <w:rFonts w:ascii="Arial" w:hAnsi="Arial"/>
+          <w:b w:val="0"/>
+          <w:sz w:val="24"/>
+        </w:rPr>
+        <w:t xml:space="preserve"> en Docker (`sonarqube:10.6-community`, puerto 9000) y se ejecutó el análisis con </w:t>
+      </w:r>
+      <w:r>
+        <w:rPr>
+          <w:rFonts w:ascii="Arial" w:hAnsi="Arial"/>
+          <w:b/>
+          <w:sz w:val="24"/>
+        </w:rPr>
+        <w:t>Sonar Scanner 3.1</w:t>
+      </w:r>
+      <w:r>
+        <w:rPr>
+          <w:rFonts w:ascii="Arial" w:hAnsi="Arial"/>
+          <w:b w:val="0"/>
+          <w:sz w:val="24"/>
+        </w:rPr>
+        <w:t xml:space="preserve"> (Node, sin JVM adicional) sobre el backend y el frontend de Atlas.</w:t>
+      </w:r>
+    </w:p>
+    <w:p>
+      <w:pPr>
+        <w:spacing w:line="240" w:lineRule="auto"/>
+        <w:jc w:val="center"/>
+      </w:pPr>
+      <w:r>
+        <w:rPr>
+          <w:rFonts w:ascii="Arial" w:hAnsi="Arial"/>
+          <w:b/>
+          <w:sz w:val="24"/>
+        </w:rPr>
+        <w:t>Métricas de calidad:</w:t>
+      </w:r>
+    </w:p>
+    <w:tbl>
+      <w:tblPr>
+        <w:tblStyle w:val="TableGrid"/>
+        <w:tblW w:type="auto" w:w="0"/>
+        <w:jc w:val="center"/>
+        <w:tblLook w:firstColumn="1" w:firstRow="1" w:lastColumn="0" w:lastRow="0" w:noHBand="0" w:noVBand="1" w:val="04A0"/>
+      </w:tblPr>
+      <w:tblGrid>
+        <w:gridCol w:w="2880"/>
+        <w:gridCol w:w="2880"/>
+        <w:gridCol w:w="2880"/>
+      </w:tblGrid>
+      <w:tr>
+        <w:tc>
+          <w:tcPr>
+            <w:tcW w:type="dxa" w:w="2880"/>
+            <w:shd w:val="clear" w:color="auto" w:fill="DDE7F0"/>
+          </w:tcPr>
+          <w:p>
+            <w:pPr>
+              <w:spacing w:line="240" w:lineRule="auto"/>
+            </w:pPr>
+            <w:r/>
+            <w:r>
+              <w:rPr>
+                <w:rFonts w:ascii="Arial" w:hAnsi="Arial"/>
+                <w:b/>
+                <w:color w:val="1F3B57"/>
+                <w:sz w:val="20"/>
+              </w:rPr>
+              <w:t>Métrica</w:t>
+            </w:r>
+          </w:p>
+        </w:tc>
+        <w:tc>
+          <w:tcPr>
+            <w:tcW w:type="dxa" w:w="2880"/>
+            <w:shd w:val="clear" w:color="auto" w:fill="DDE7F0"/>
+          </w:tcPr>
+          <w:p>
+            <w:pPr>
+              <w:spacing w:line="240" w:lineRule="auto"/>
+            </w:pPr>
+            <w:r/>
+            <w:r>
+              <w:rPr>
+                <w:rFonts w:ascii="Arial" w:hAnsi="Arial"/>
+                <w:b/>
+                <w:color w:val="1F3B57"/>
+                <w:sz w:val="20"/>
+              </w:rPr>
+              <w:t>Backend (`atlas`)</w:t>
+            </w:r>
+          </w:p>
+        </w:tc>
+        <w:tc>
+          <w:tcPr>
+            <w:tcW w:type="dxa" w:w="2880"/>
+            <w:shd w:val="clear" w:color="auto" w:fill="DDE7F0"/>
+          </w:tcPr>
+          <w:p>
+            <w:pPr>
+              <w:spacing w:line="240" w:lineRule="auto"/>
+            </w:pPr>
+            <w:r/>
+            <w:r>
+              <w:rPr>
+                <w:rFonts w:ascii="Arial" w:hAnsi="Arial"/>
+                <w:b/>
+                <w:color w:val="1F3B57"/>
+                <w:sz w:val="20"/>
+              </w:rPr>
+              <w:t>Frontend (`atlas-frontend`)</w:t>
+            </w:r>
+          </w:p>
+        </w:tc>
+      </w:tr>
+      <w:tr>
+        <w:tc>
+          <w:tcPr>
+            <w:tcW w:type="dxa" w:w="2880"/>
+          </w:tcPr>
+          <w:p>
+            <w:pPr>
+              <w:spacing w:line="240" w:lineRule="auto"/>
+            </w:pPr>
+            <w:r/>
+            <w:r>
+              <w:rPr>
+                <w:rFonts w:ascii="Arial" w:hAnsi="Arial"/>
+                <w:sz w:val="20"/>
+              </w:rPr>
+              <w:t>Líneas de código (ncloc)</w:t>
+            </w:r>
+          </w:p>
+        </w:tc>
+        <w:tc>
+          <w:tcPr>
+            <w:tcW w:type="dxa" w:w="2880"/>
+          </w:tcPr>
+          <w:p>
+            <w:pPr>
+              <w:spacing w:line="240" w:lineRule="auto"/>
+            </w:pPr>
+            <w:r/>
+            <w:r>
+              <w:rPr>
+                <w:rFonts w:ascii="Arial" w:hAnsi="Arial"/>
+                <w:sz w:val="20"/>
+              </w:rPr>
+              <w:t>1.523</w:t>
+            </w:r>
+          </w:p>
+        </w:tc>
+        <w:tc>
+          <w:tcPr>
+            <w:tcW w:type="dxa" w:w="2880"/>
+          </w:tcPr>
+          <w:p>
+            <w:pPr>
+              <w:spacing w:line="240" w:lineRule="auto"/>
+            </w:pPr>
+            <w:r/>
+            <w:r>
+              <w:rPr>
+                <w:rFonts w:ascii="Arial" w:hAnsi="Arial"/>
+                <w:sz w:val="20"/>
+              </w:rPr>
+              <w:t>5.432</w:t>
+            </w:r>
+          </w:p>
+        </w:tc>
+      </w:tr>
+      <w:tr>
+        <w:tc>
+          <w:tcPr>
+            <w:tcW w:type="dxa" w:w="2880"/>
+          </w:tcPr>
+          <w:p>
+            <w:pPr>
+              <w:spacing w:line="240" w:lineRule="auto"/>
+            </w:pPr>
+            <w:r/>
+            <w:r>
+              <w:rPr>
+                <w:rFonts w:ascii="Arial" w:hAnsi="Arial"/>
+                <w:sz w:val="20"/>
+              </w:rPr>
+              <w:t>Bugs</w:t>
+            </w:r>
+          </w:p>
+        </w:tc>
+        <w:tc>
+          <w:tcPr>
+            <w:tcW w:type="dxa" w:w="2880"/>
+          </w:tcPr>
+          <w:p>
+            <w:pPr>
+              <w:spacing w:line="240" w:lineRule="auto"/>
+            </w:pPr>
+            <w:r/>
+            <w:r>
+              <w:rPr>
+                <w:rFonts w:ascii="Arial" w:hAnsi="Arial"/>
+                <w:sz w:val="20"/>
+              </w:rPr>
+              <w:t>0</w:t>
+            </w:r>
+          </w:p>
+        </w:tc>
+        <w:tc>
+          <w:tcPr>
+            <w:tcW w:type="dxa" w:w="2880"/>
+          </w:tcPr>
+          <w:p>
+            <w:pPr>
+              <w:spacing w:line="240" w:lineRule="auto"/>
+            </w:pPr>
+            <w:r/>
+            <w:r>
+              <w:rPr>
+                <w:rFonts w:ascii="Arial" w:hAnsi="Arial"/>
+                <w:sz w:val="20"/>
+              </w:rPr>
+              <w:t>1</w:t>
+            </w:r>
+          </w:p>
+        </w:tc>
+      </w:tr>
+      <w:tr>
+        <w:tc>
+          <w:tcPr>
+            <w:tcW w:type="dxa" w:w="2880"/>
+          </w:tcPr>
+          <w:p>
+            <w:pPr>
+              <w:spacing w:line="240" w:lineRule="auto"/>
+            </w:pPr>
+            <w:r/>
+            <w:r>
+              <w:rPr>
+                <w:rFonts w:ascii="Arial" w:hAnsi="Arial"/>
+                <w:sz w:val="20"/>
+              </w:rPr>
+              <w:t>Vulnerabilidades</w:t>
+            </w:r>
+          </w:p>
+        </w:tc>
+        <w:tc>
+          <w:tcPr>
+            <w:tcW w:type="dxa" w:w="2880"/>
+          </w:tcPr>
+          <w:p>
+            <w:pPr>
+              <w:spacing w:line="240" w:lineRule="auto"/>
+            </w:pPr>
+            <w:r/>
+            <w:r>
+              <w:rPr>
+                <w:rFonts w:ascii="Arial" w:hAnsi="Arial"/>
+                <w:sz w:val="20"/>
+              </w:rPr>
+              <w:t>**1**</w:t>
+            </w:r>
+          </w:p>
+        </w:tc>
+        <w:tc>
+          <w:tcPr>
+            <w:tcW w:type="dxa" w:w="2880"/>
+          </w:tcPr>
+          <w:p>
+            <w:pPr>
+              <w:spacing w:line="240" w:lineRule="auto"/>
+            </w:pPr>
+            <w:r/>
+            <w:r>
+              <w:rPr>
+                <w:rFonts w:ascii="Arial" w:hAnsi="Arial"/>
+                <w:sz w:val="20"/>
+              </w:rPr>
+              <w:t>0</w:t>
+            </w:r>
+          </w:p>
+        </w:tc>
+      </w:tr>
+      <w:tr>
+        <w:tc>
+          <w:tcPr>
+            <w:tcW w:type="dxa" w:w="2880"/>
+          </w:tcPr>
+          <w:p>
+            <w:pPr>
+              <w:spacing w:line="240" w:lineRule="auto"/>
+            </w:pPr>
+            <w:r/>
+            <w:r>
+              <w:rPr>
+                <w:rFonts w:ascii="Arial" w:hAnsi="Arial"/>
+                <w:sz w:val="20"/>
+              </w:rPr>
+              <w:t>Code Smells</w:t>
+            </w:r>
+          </w:p>
+        </w:tc>
+        <w:tc>
+          <w:tcPr>
+            <w:tcW w:type="dxa" w:w="2880"/>
+          </w:tcPr>
+          <w:p>
+            <w:pPr>
+              <w:spacing w:line="240" w:lineRule="auto"/>
+            </w:pPr>
+            <w:r/>
+            <w:r>
+              <w:rPr>
+                <w:rFonts w:ascii="Arial" w:hAnsi="Arial"/>
+                <w:sz w:val="20"/>
+              </w:rPr>
+              <w:t>17</w:t>
+            </w:r>
+          </w:p>
+        </w:tc>
+        <w:tc>
+          <w:tcPr>
+            <w:tcW w:type="dxa" w:w="2880"/>
+          </w:tcPr>
+          <w:p>
+            <w:pPr>
+              <w:spacing w:line="240" w:lineRule="auto"/>
+            </w:pPr>
+            <w:r/>
+            <w:r>
+              <w:rPr>
+                <w:rFonts w:ascii="Arial" w:hAnsi="Arial"/>
+                <w:sz w:val="20"/>
+              </w:rPr>
+              <w:t>181</w:t>
+            </w:r>
+          </w:p>
+        </w:tc>
+      </w:tr>
+      <w:tr>
+        <w:tc>
+          <w:tcPr>
+            <w:tcW w:type="dxa" w:w="2880"/>
+          </w:tcPr>
+          <w:p>
+            <w:pPr>
+              <w:spacing w:line="240" w:lineRule="auto"/>
+            </w:pPr>
+            <w:r/>
+            <w:r>
+              <w:rPr>
+                <w:rFonts w:ascii="Arial" w:hAnsi="Arial"/>
+                <w:sz w:val="20"/>
+              </w:rPr>
+              <w:t>Security Hotspots</w:t>
+            </w:r>
+          </w:p>
+        </w:tc>
+        <w:tc>
+          <w:tcPr>
+            <w:tcW w:type="dxa" w:w="2880"/>
+          </w:tcPr>
+          <w:p>
+            <w:pPr>
+              <w:spacing w:line="240" w:lineRule="auto"/>
+            </w:pPr>
+            <w:r/>
+            <w:r>
+              <w:rPr>
+                <w:rFonts w:ascii="Arial" w:hAnsi="Arial"/>
+                <w:sz w:val="20"/>
+              </w:rPr>
+              <w:t>4</w:t>
+            </w:r>
+          </w:p>
+        </w:tc>
+        <w:tc>
+          <w:tcPr>
+            <w:tcW w:type="dxa" w:w="2880"/>
+          </w:tcPr>
+          <w:p>
+            <w:pPr>
+              <w:spacing w:line="240" w:lineRule="auto"/>
+            </w:pPr>
+            <w:r/>
+            <w:r>
+              <w:rPr>
+                <w:rFonts w:ascii="Arial" w:hAnsi="Arial"/>
+                <w:sz w:val="20"/>
+              </w:rPr>
+              <w:t>0</w:t>
+            </w:r>
+          </w:p>
+        </w:tc>
+      </w:tr>
+      <w:tr>
+        <w:tc>
+          <w:tcPr>
+            <w:tcW w:type="dxa" w:w="2880"/>
+          </w:tcPr>
+          <w:p>
+            <w:pPr>
+              <w:spacing w:line="240" w:lineRule="auto"/>
+            </w:pPr>
+            <w:r/>
+            <w:r>
+              <w:rPr>
+                <w:rFonts w:ascii="Arial" w:hAnsi="Arial"/>
+                <w:sz w:val="20"/>
+              </w:rPr>
+              <w:t>Duplicación (%)</w:t>
+            </w:r>
+          </w:p>
+        </w:tc>
+        <w:tc>
+          <w:tcPr>
+            <w:tcW w:type="dxa" w:w="2880"/>
+          </w:tcPr>
+          <w:p>
+            <w:pPr>
+              <w:spacing w:line="240" w:lineRule="auto"/>
+            </w:pPr>
+            <w:r/>
+            <w:r>
+              <w:rPr>
+                <w:rFonts w:ascii="Arial" w:hAnsi="Arial"/>
+                <w:sz w:val="20"/>
+              </w:rPr>
+              <w:t>37,0</w:t>
+            </w:r>
+          </w:p>
+        </w:tc>
+        <w:tc>
+          <w:tcPr>
+            <w:tcW w:type="dxa" w:w="2880"/>
+          </w:tcPr>
+          <w:p>
+            <w:pPr>
+              <w:spacing w:line="240" w:lineRule="auto"/>
+            </w:pPr>
+            <w:r/>
+            <w:r>
+              <w:rPr>
+                <w:rFonts w:ascii="Arial" w:hAnsi="Arial"/>
+                <w:sz w:val="20"/>
+              </w:rPr>
+              <w:t>11,1</w:t>
+            </w:r>
+          </w:p>
+        </w:tc>
+      </w:tr>
+      <w:tr>
+        <w:tc>
+          <w:tcPr>
+            <w:tcW w:type="dxa" w:w="2880"/>
+          </w:tcPr>
+          <w:p>
+            <w:pPr>
+              <w:spacing w:line="240" w:lineRule="auto"/>
+            </w:pPr>
+            <w:r/>
+            <w:r>
+              <w:rPr>
+                <w:rFonts w:ascii="Arial" w:hAnsi="Arial"/>
+                <w:sz w:val="20"/>
+              </w:rPr>
+              <w:t>Cobertura</w:t>
+            </w:r>
+          </w:p>
+        </w:tc>
+        <w:tc>
+          <w:tcPr>
+            <w:tcW w:type="dxa" w:w="2880"/>
+          </w:tcPr>
+          <w:p>
+            <w:pPr>
+              <w:spacing w:line="240" w:lineRule="auto"/>
+            </w:pPr>
+            <w:r/>
+            <w:r>
+              <w:rPr>
+                <w:rFonts w:ascii="Arial" w:hAnsi="Arial"/>
+                <w:sz w:val="20"/>
+              </w:rPr>
+              <w:t>0 % (sin tests)</w:t>
+            </w:r>
+          </w:p>
+        </w:tc>
+        <w:tc>
+          <w:tcPr>
+            <w:tcW w:type="dxa" w:w="2880"/>
+          </w:tcPr>
+          <w:p>
+            <w:pPr>
+              <w:spacing w:line="240" w:lineRule="auto"/>
+            </w:pPr>
+            <w:r/>
+            <w:r>
+              <w:rPr>
+                <w:rFonts w:ascii="Arial" w:hAnsi="Arial"/>
+                <w:sz w:val="20"/>
+              </w:rPr>
+              <w:t>0 %</w:t>
+            </w:r>
+          </w:p>
+        </w:tc>
+      </w:tr>
+      <w:tr>
+        <w:tc>
+          <w:tcPr>
+            <w:tcW w:type="dxa" w:w="2880"/>
+          </w:tcPr>
+          <w:p>
+            <w:pPr>
+              <w:spacing w:line="240" w:lineRule="auto"/>
+            </w:pPr>
+            <w:r/>
+            <w:r>
+              <w:rPr>
+                <w:rFonts w:ascii="Arial" w:hAnsi="Arial"/>
+                <w:sz w:val="20"/>
+              </w:rPr>
+              <w:t>Reliability Rating</w:t>
+            </w:r>
+          </w:p>
+        </w:tc>
+        <w:tc>
+          <w:tcPr>
+            <w:tcW w:type="dxa" w:w="2880"/>
+          </w:tcPr>
+          <w:p>
+            <w:pPr>
+              <w:spacing w:line="240" w:lineRule="auto"/>
+            </w:pPr>
+            <w:r/>
+            <w:r>
+              <w:rPr>
+                <w:rFonts w:ascii="Arial" w:hAnsi="Arial"/>
+                <w:sz w:val="20"/>
+              </w:rPr>
+              <w:t>A (1.0)</w:t>
+            </w:r>
+          </w:p>
+        </w:tc>
+        <w:tc>
+          <w:tcPr>
+            <w:tcW w:type="dxa" w:w="2880"/>
+          </w:tcPr>
+          <w:p>
+            <w:pPr>
+              <w:spacing w:line="240" w:lineRule="auto"/>
+            </w:pPr>
+            <w:r/>
+            <w:r>
+              <w:rPr>
+                <w:rFonts w:ascii="Arial" w:hAnsi="Arial"/>
+                <w:sz w:val="20"/>
+              </w:rPr>
+              <w:t>C (3.0)</w:t>
+            </w:r>
+          </w:p>
+        </w:tc>
+      </w:tr>
+      <w:tr>
+        <w:tc>
+          <w:tcPr>
+            <w:tcW w:type="dxa" w:w="2880"/>
+          </w:tcPr>
+          <w:p>
+            <w:pPr>
+              <w:spacing w:line="240" w:lineRule="auto"/>
+            </w:pPr>
+            <w:r/>
+            <w:r>
+              <w:rPr>
+                <w:rFonts w:ascii="Arial" w:hAnsi="Arial"/>
+                <w:sz w:val="20"/>
+              </w:rPr>
+              <w:t>Security Rating</w:t>
+            </w:r>
+          </w:p>
+        </w:tc>
+        <w:tc>
+          <w:tcPr>
+            <w:tcW w:type="dxa" w:w="2880"/>
+          </w:tcPr>
+          <w:p>
+            <w:pPr>
+              <w:spacing w:line="240" w:lineRule="auto"/>
+            </w:pPr>
+            <w:r/>
+            <w:r>
+              <w:rPr>
+                <w:rFonts w:ascii="Arial" w:hAnsi="Arial"/>
+                <w:sz w:val="20"/>
+              </w:rPr>
+              <w:t>**E (5.0)**</w:t>
+            </w:r>
+          </w:p>
+        </w:tc>
+        <w:tc>
+          <w:tcPr>
+            <w:tcW w:type="dxa" w:w="2880"/>
+          </w:tcPr>
+          <w:p>
+            <w:pPr>
+              <w:spacing w:line="240" w:lineRule="auto"/>
+            </w:pPr>
+            <w:r/>
+            <w:r>
+              <w:rPr>
+                <w:rFonts w:ascii="Arial" w:hAnsi="Arial"/>
+                <w:sz w:val="20"/>
+              </w:rPr>
+              <w:t>A (1.0)</w:t>
+            </w:r>
+          </w:p>
+        </w:tc>
+      </w:tr>
+      <w:tr>
+        <w:tc>
+          <w:tcPr>
+            <w:tcW w:type="dxa" w:w="2880"/>
+          </w:tcPr>
+          <w:p>
+            <w:pPr>
+              <w:spacing w:line="240" w:lineRule="auto"/>
+            </w:pPr>
+            <w:r/>
+            <w:r>
+              <w:rPr>
+                <w:rFonts w:ascii="Arial" w:hAnsi="Arial"/>
+                <w:sz w:val="20"/>
+              </w:rPr>
+              <w:t>Maintainability Rating</w:t>
+            </w:r>
+          </w:p>
+        </w:tc>
+        <w:tc>
+          <w:tcPr>
+            <w:tcW w:type="dxa" w:w="2880"/>
+          </w:tcPr>
+          <w:p>
+            <w:pPr>
+              <w:spacing w:line="240" w:lineRule="auto"/>
+            </w:pPr>
+            <w:r/>
+            <w:r>
+              <w:rPr>
+                <w:rFonts w:ascii="Arial" w:hAnsi="Arial"/>
+                <w:sz w:val="20"/>
+              </w:rPr>
+              <w:t>A (1.0)</w:t>
+            </w:r>
+          </w:p>
+        </w:tc>
+        <w:tc>
+          <w:tcPr>
+            <w:tcW w:type="dxa" w:w="2880"/>
+          </w:tcPr>
+          <w:p>
+            <w:pPr>
+              <w:spacing w:line="240" w:lineRule="auto"/>
+            </w:pPr>
+            <w:r/>
+            <w:r>
+              <w:rPr>
+                <w:rFonts w:ascii="Arial" w:hAnsi="Arial"/>
+                <w:sz w:val="20"/>
+              </w:rPr>
+              <w:t>A (1.0)</w:t>
+            </w:r>
+          </w:p>
+        </w:tc>
+      </w:tr>
+      <w:tr>
+        <w:tc>
+          <w:tcPr>
+            <w:tcW w:type="dxa" w:w="2880"/>
+          </w:tcPr>
+          <w:p>
+            <w:pPr>
+              <w:spacing w:line="240" w:lineRule="auto"/>
+            </w:pPr>
+            <w:r/>
+            <w:r>
+              <w:rPr>
+                <w:rFonts w:ascii="Arial" w:hAnsi="Arial"/>
+                <w:sz w:val="20"/>
+              </w:rPr>
+              <w:t>Quality Gate</w:t>
+            </w:r>
+          </w:p>
+        </w:tc>
+        <w:tc>
+          <w:tcPr>
+            <w:tcW w:type="dxa" w:w="2880"/>
+          </w:tcPr>
+          <w:p>
+            <w:pPr>
+              <w:spacing w:line="240" w:lineRule="auto"/>
+            </w:pPr>
+            <w:r/>
+            <w:r>
+              <w:rPr>
+                <w:rFonts w:ascii="Arial" w:hAnsi="Arial"/>
+                <w:sz w:val="20"/>
+              </w:rPr>
+              <w:t>OK</w:t>
+            </w:r>
+          </w:p>
+        </w:tc>
+        <w:tc>
+          <w:tcPr>
+            <w:tcW w:type="dxa" w:w="2880"/>
+          </w:tcPr>
+          <w:p>
+            <w:pPr>
+              <w:spacing w:line="240" w:lineRule="auto"/>
+            </w:pPr>
+            <w:r/>
+            <w:r>
+              <w:rPr>
+                <w:rFonts w:ascii="Arial" w:hAnsi="Arial"/>
+                <w:sz w:val="20"/>
+              </w:rPr>
+              <w:t>OK</w:t>
+            </w:r>
+          </w:p>
+        </w:tc>
+      </w:tr>
+    </w:tbl>
+    <w:p>
+      <w:pPr>
+        <w:spacing w:line="360" w:lineRule="auto"/>
+      </w:pPr>
+      <w:r>
+        <w:rPr>
+          <w:rFonts w:ascii="Arial" w:hAnsi="Arial"/>
+          <w:b w:val="0"/>
+          <w:sz w:val="12"/>
+        </w:rPr>
+      </w:r>
+    </w:p>
+    <w:p>
+      <w:pPr>
+        <w:spacing w:line="240" w:lineRule="auto"/>
+        <w:jc w:val="center"/>
+      </w:pPr>
+      <w:r>
+        <w:rPr>
+          <w:rFonts w:ascii="Arial" w:hAnsi="Arial"/>
+          <w:b w:val="0"/>
+          <w:sz w:val="24"/>
+        </w:rPr>
+        <w:t xml:space="preserve">&gt; El </w:t>
+      </w:r>
+      <w:r>
+        <w:rPr>
+          <w:rFonts w:ascii="Arial" w:hAnsi="Arial"/>
+          <w:b/>
+          <w:sz w:val="24"/>
+        </w:rPr>
+        <w:t>Security Rating E</w:t>
+      </w:r>
+      <w:r>
+        <w:rPr>
+          <w:rFonts w:ascii="Arial" w:hAnsi="Arial"/>
+          <w:b w:val="0"/>
+          <w:sz w:val="24"/>
+        </w:rPr>
+        <w:t xml:space="preserve"> del backend confirma los problemas de seguridad críticos detectados en las pruebas dinámicas y en la revisión manual. El Quality Gate figura "OK" porque el *Quality Gate* por defecto solo evalúa bugs y debt; ajustamos esta observación en las recomendaciones (agregar condiciones de seguridad).</w:t>
+      </w:r>
+    </w:p>
+    <w:p>
+      <w:pPr>
+        <w:spacing w:line="240" w:lineRule="auto"/>
+        <w:jc w:val="center"/>
+      </w:pPr>
+      <w:r>
+        <w:rPr>
+          <w:rFonts w:ascii="Arial" w:hAnsi="Arial"/>
+          <w:b/>
+          <w:sz w:val="24"/>
+        </w:rPr>
+        <w:t>Hallazgos relevantes de SonarQube:</w:t>
+      </w:r>
+    </w:p>
+    <w:p>
+      <w:pPr>
+        <w:spacing w:line="240" w:lineRule="auto"/>
+        <w:jc w:val="center"/>
+      </w:pPr>
+      <w:r>
+        <w:rPr>
+          <w:rFonts w:ascii="Arial" w:hAnsi="Arial"/>
+          <w:b/>
+          <w:sz w:val="24"/>
+        </w:rPr>
+        <w:t>Backend (`atlas`)</w:t>
+      </w:r>
+    </w:p>
+    <w:p>
+      <w:pPr>
+        <w:spacing w:line="360" w:lineRule="auto"/>
+        <w:jc w:val="center"/>
+      </w:pPr>
+      <w:r>
+        <w:rPr>
+          <w:rFonts w:ascii="Arial" w:hAnsi="Arial"/>
+          <w:b w:val="0"/>
+          <w:sz w:val="24"/>
+        </w:rPr>
+        <w:t>**Vulnerabilidad BLOCKER — `src/db.js:6` (secrets:S6698):** "Make sure this PostgreSQL database password gets changed and removed from the code." Confirma el hallazgo manual de credenciales de BD en la cadena de conexión por defecto.</w:t>
+      </w:r>
+    </w:p>
+    <w:p>
+      <w:pPr>
+        <w:spacing w:line="360" w:lineRule="auto"/>
+        <w:jc w:val="center"/>
+      </w:pPr>
+      <w:r>
+        <w:rPr>
+          <w:rFonts w:ascii="Arial" w:hAnsi="Arial"/>
+          <w:b w:val="0"/>
+          <w:sz w:val="24"/>
+        </w:rPr>
+        <w:t>16 Code Smells **MINOR** (`javascript:S6582`): preferir *optional chaining* en `clients.js`, `contracts.js`, `empresa_usuarios.js`, `metricas.js`.</w:t>
+      </w:r>
+    </w:p>
+    <w:p>
+      <w:pPr>
+        <w:spacing w:line="360" w:lineRule="auto"/>
+        <w:jc w:val="center"/>
+      </w:pPr>
+      <w:r>
+        <w:rPr>
+          <w:rFonts w:ascii="Arial" w:hAnsi="Arial"/>
+          <w:b w:val="0"/>
+          <w:sz w:val="24"/>
+        </w:rPr>
+        <w:t>1 Code Smell **MAJOR** (`users.js:44`, `javascript:S125`): código comentado.</w:t>
+      </w:r>
+    </w:p>
+    <w:p>
+      <w:pPr>
+        <w:spacing w:line="360" w:lineRule="auto"/>
+        <w:jc w:val="center"/>
+      </w:pPr>
+      <w:r>
+        <w:rPr>
+          <w:rFonts w:ascii="Arial" w:hAnsi="Arial"/>
+          <w:b w:val="0"/>
+          <w:sz w:val="24"/>
+        </w:rPr>
+        <w:t>4 Security Hotspots:</w:t>
+      </w:r>
+    </w:p>
+    <w:p>
+      <w:pPr>
+        <w:spacing w:line="360" w:lineRule="auto"/>
+        <w:jc w:val="center"/>
+      </w:pPr>
+      <w:r>
+        <w:rPr>
+          <w:rFonts w:ascii="Arial" w:hAnsi="Arial"/>
+          <w:b w:val="0"/>
+          <w:sz w:val="24"/>
+        </w:rPr>
+        <w:t>`contracts.js:14-15` (`dos`): "Make sure the content length limit is safe here" — límite de tamaño de upload no definido (relacionado con BUG-003).</w:t>
+      </w:r>
+    </w:p>
+    <w:p>
+      <w:pPr>
+        <w:spacing w:line="360" w:lineRule="auto"/>
+        <w:jc w:val="center"/>
+      </w:pPr>
+      <w:r>
+        <w:rPr>
+          <w:rFonts w:ascii="Arial" w:hAnsi="Arial"/>
+          <w:b w:val="0"/>
+          <w:sz w:val="24"/>
+        </w:rPr>
+        <w:t>`app.js:22` (`insecure-conf`): "Make sure that enabling CORS is safe here" (relacionado con BUG-005).</w:t>
+      </w:r>
+    </w:p>
+    <w:p>
+      <w:pPr>
+        <w:spacing w:line="360" w:lineRule="auto"/>
+        <w:jc w:val="center"/>
+      </w:pPr>
+      <w:r>
+        <w:rPr>
+          <w:rFonts w:ascii="Arial" w:hAnsi="Arial"/>
+          <w:b w:val="0"/>
+          <w:sz w:val="24"/>
+        </w:rPr>
+        <w:t>`app.js:20` (`others`): la plataforma expone la versión de Express por defecto.</w:t>
+      </w:r>
+    </w:p>
+    <w:p>
+      <w:pPr>
+        <w:spacing w:line="240" w:lineRule="auto"/>
+        <w:jc w:val="center"/>
+      </w:pPr>
+      <w:r>
+        <w:rPr>
+          <w:rFonts w:ascii="Arial" w:hAnsi="Arial"/>
+          <w:b/>
+          <w:sz w:val="24"/>
+        </w:rPr>
+        <w:t>Frontend (`atlas-frontend`)</w:t>
+      </w:r>
+    </w:p>
+    <w:p>
+      <w:pPr>
+        <w:spacing w:line="360" w:lineRule="auto"/>
+        <w:jc w:val="center"/>
+      </w:pPr>
+      <w:r>
+        <w:rPr>
+          <w:rFonts w:ascii="Arial" w:hAnsi="Arial"/>
+          <w:b w:val="0"/>
+          <w:sz w:val="24"/>
+        </w:rPr>
+        <w:t>1 **BUG MAJOR** (`src/index.css:6`, `css:S4649`): falta *generic font family* de respaldo.</w:t>
+      </w:r>
+    </w:p>
+    <w:p>
+      <w:pPr>
+        <w:spacing w:line="360" w:lineRule="auto"/>
+        <w:jc w:val="center"/>
+      </w:pPr>
+      <w:r>
+        <w:rPr>
+          <w:rFonts w:ascii="Arial" w:hAnsi="Arial"/>
+          <w:b w:val="0"/>
+          <w:sz w:val="24"/>
+        </w:rPr>
+        <w:t>1 **Code Smell CRITICAL** (`ClienteForm.jsx:63`, `javascript:S3776`): Complejidad cognitiva 26 vs 15 permitido.</w:t>
+      </w:r>
+    </w:p>
+    <w:p>
+      <w:pPr>
+        <w:spacing w:line="360" w:lineRule="auto"/>
+        <w:jc w:val="center"/>
+      </w:pPr>
+      <w:r>
+        <w:rPr>
+          <w:rFonts w:ascii="Arial" w:hAnsi="Arial"/>
+          <w:b w:val="0"/>
+          <w:sz w:val="24"/>
+        </w:rPr>
+        <w:t>181 Code Smells: 110 × validación de props (`S6774`), 45 × API deprecada (`S1874`, `*.findDOMNode`), 16 × definir componente dentro del padre (`S6478`), etc.</w:t>
+      </w:r>
+    </w:p>
+    <w:p>
+      <w:pPr>
+        <w:spacing w:line="360" w:lineRule="auto"/>
+        <w:jc w:val="center"/>
+      </w:pPr>
+      <w:r>
+        <w:rPr>
+          <w:rFonts w:ascii="Arial" w:hAnsi="Arial"/>
+          <w:b w:val="0"/>
+          <w:sz w:val="24"/>
+        </w:rPr>
+        <w:t>1 BUG de compatibilidad de React 19 (`findDOMNode` deprecado, relacionado con `S1874`).</w:t>
+      </w:r>
+    </w:p>
+    <w:p>
+      <w:pPr>
+        <w:spacing w:line="240" w:lineRule="auto"/>
+        <w:jc w:val="center"/>
+      </w:pPr>
+      <w:r>
+        <w:rPr>
+          <w:rFonts w:ascii="Arial" w:hAnsi="Arial"/>
+          <w:b/>
+          <w:sz w:val="24"/>
+        </w:rPr>
+        <w:t>Comando usado (evidencia reproducible):</w:t>
+      </w:r>
+    </w:p>
+    <w:p>
+      <w:pPr>
+        <w:spacing w:line="240" w:lineRule="auto"/>
+        <w:jc w:val="center"/>
+      </w:pPr>
+      <w:r>
+        <w:rPr>
+          <w:rFonts w:ascii="Arial" w:hAnsi="Arial"/>
+          <w:b w:val="0"/>
+          <w:sz w:val="24"/>
+        </w:rPr>
+        <w:t>```bash</w:t>
+      </w:r>
+    </w:p>
+    <w:p>
+      <w:pPr>
+        <w:spacing w:before="1200" w:line="240" w:lineRule="auto"/>
+        <w:jc w:val="center"/>
+      </w:pPr>
+      <w:r>
+        <w:rPr>
+          <w:rFonts w:ascii="Arial" w:hAnsi="Arial"/>
+          <w:b/>
+          <w:color w:val="1F3B57"/>
+          <w:sz w:val="52"/>
+        </w:rPr>
+        <w:t>1) Servidor SonarQube</w:t>
+      </w:r>
+    </w:p>
+    <w:p>
+      <w:pPr>
+        <w:spacing w:line="240" w:lineRule="auto"/>
+        <w:jc w:val="center"/>
+      </w:pPr>
+      <w:r>
+        <w:rPr>
+          <w:rFonts w:ascii="Arial" w:hAnsi="Arial"/>
+          <w:b w:val="0"/>
+          <w:sz w:val="24"/>
+        </w:rPr>
+        <w:t>docker run -d --name sonarqube -p 9000:9000 \</w:t>
+      </w:r>
+    </w:p>
+    <w:p>
+      <w:pPr>
+        <w:spacing w:line="240" w:lineRule="auto"/>
+        <w:jc w:val="center"/>
+      </w:pPr>
+      <w:r>
+        <w:rPr>
+          <w:rFonts w:ascii="Arial" w:hAnsi="Arial"/>
+          <w:b w:val="0"/>
+          <w:sz w:val="24"/>
+        </w:rPr>
+        <w:t>-e SONAR_ES_BOOTSTRAP_CHECKS_DISABLE=true \</w:t>
+      </w:r>
+    </w:p>
+    <w:p>
+      <w:pPr>
+        <w:spacing w:line="240" w:lineRule="auto"/>
+        <w:jc w:val="center"/>
+      </w:pPr>
+      <w:r>
+        <w:rPr>
+          <w:rFonts w:ascii="Arial" w:hAnsi="Arial"/>
+          <w:b w:val="0"/>
+          <w:sz w:val="24"/>
+        </w:rPr>
+        <w:t>-v sonarqube_data:/opt/sonarqube/data \</w:t>
+      </w:r>
+    </w:p>
+    <w:p>
+      <w:pPr>
+        <w:spacing w:line="240" w:lineRule="auto"/>
+        <w:jc w:val="center"/>
+      </w:pPr>
+      <w:r>
+        <w:rPr>
+          <w:rFonts w:ascii="Arial" w:hAnsi="Arial"/>
+          <w:b w:val="0"/>
+          <w:sz w:val="24"/>
+        </w:rPr>
+        <w:t>-v sonarqube_logs:/opt/sonarqube/logs \</w:t>
+      </w:r>
+    </w:p>
+    <w:p>
+      <w:pPr>
+        <w:spacing w:line="240" w:lineRule="auto"/>
+        <w:jc w:val="center"/>
+      </w:pPr>
+      <w:r>
+        <w:rPr>
+          <w:rFonts w:ascii="Arial" w:hAnsi="Arial"/>
+          <w:b w:val="0"/>
+          <w:sz w:val="24"/>
+        </w:rPr>
+        <w:t>-v sonarqube_extensions:/opt/sonarqube/extensions \</w:t>
+      </w:r>
+    </w:p>
+    <w:p>
+      <w:pPr>
+        <w:spacing w:line="240" w:lineRule="auto"/>
+        <w:jc w:val="center"/>
+      </w:pPr>
+      <w:r>
+        <w:rPr>
+          <w:rFonts w:ascii="Arial" w:hAnsi="Arial"/>
+          <w:b w:val="0"/>
+          <w:sz w:val="24"/>
+        </w:rPr>
+        <w:t>sonarqube:10.6-community</w:t>
+      </w:r>
+    </w:p>
+    <w:p>
+      <w:pPr>
+        <w:spacing w:before="1200" w:line="240" w:lineRule="auto"/>
+        <w:jc w:val="center"/>
+      </w:pPr>
+      <w:r>
+        <w:rPr>
+          <w:rFonts w:ascii="Arial" w:hAnsi="Arial"/>
+          <w:b/>
+          <w:color w:val="1F3B57"/>
+          <w:sz w:val="52"/>
+        </w:rPr>
+        <w:t>2) Scan (en BACKEND/ y luego en FRONTEND/, con su sonar-project.properties)</w:t>
+      </w:r>
+    </w:p>
+    <w:p>
+      <w:pPr>
+        <w:spacing w:line="240" w:lineRule="auto"/>
+        <w:jc w:val="center"/>
+      </w:pPr>
+      <w:r>
+        <w:rPr>
+          <w:rFonts w:ascii="Arial" w:hAnsi="Arial"/>
+          <w:b w:val="0"/>
+          <w:sz w:val="24"/>
+        </w:rPr>
+        <w:t>sonar-scanner -Dsonar.host.url=http://localhost:9000 -Dsonar.token=TOKEN</w:t>
+      </w:r>
+    </w:p>
+    <w:p>
+      <w:pPr>
+        <w:spacing w:line="240" w:lineRule="auto"/>
+        <w:jc w:val="center"/>
+      </w:pPr>
+      <w:r>
+        <w:rPr>
+          <w:rFonts w:ascii="Arial" w:hAnsi="Arial"/>
+          <w:b w:val="0"/>
+          <w:sz w:val="24"/>
+        </w:rPr>
+        <w:t>```</w:t>
+      </w:r>
+    </w:p>
+    <w:p>
+      <w:pPr>
+        <w:spacing w:line="240" w:lineRule="auto"/>
+        <w:jc w:val="center"/>
+      </w:pPr>
+      <w:r>
+        <w:rPr>
+          <w:rFonts w:ascii="Arial" w:hAnsi="Arial"/>
+          <w:b/>
+          <w:sz w:val="24"/>
+        </w:rPr>
+        <w:t>Conclusiones del análisis estático:</w:t>
+      </w:r>
+      <w:r>
+        <w:rPr>
+          <w:rFonts w:ascii="Arial" w:hAnsi="Arial"/>
+          <w:b w:val="0"/>
+          <w:sz w:val="24"/>
+        </w:rPr>
+        <w:t xml:space="preserve"> SonarQube encontró </w:t>
+      </w:r>
+      <w:r>
+        <w:rPr>
+          <w:rFonts w:ascii="Arial" w:hAnsi="Arial"/>
+          <w:b/>
+          <w:sz w:val="24"/>
+        </w:rPr>
+        <w:t>1 vulnerabilidad de severidad Blocker</w:t>
+      </w:r>
+      <w:r>
+        <w:rPr>
+          <w:rFonts w:ascii="Arial" w:hAnsi="Arial"/>
+          <w:b w:val="0"/>
+          <w:sz w:val="24"/>
+        </w:rPr>
+        <w:t xml:space="preserve"> (credenciales de PostgreSQL en código), </w:t>
+      </w:r>
+      <w:r>
+        <w:rPr>
+          <w:rFonts w:ascii="Arial" w:hAnsi="Arial"/>
+          <w:b/>
+          <w:sz w:val="24"/>
+        </w:rPr>
+        <w:t>4 security hotspots</w:t>
+      </w:r>
+      <w:r>
+        <w:rPr>
+          <w:rFonts w:ascii="Arial" w:hAnsi="Arial"/>
+          <w:b w:val="0"/>
+          <w:sz w:val="24"/>
+        </w:rPr>
+        <w:t xml:space="preserve"> que corresponden exactamente a los defectos BUG-003 y BUG-005 detectados en las pruebas dinámicas, y una deuda técnica de mantenibilidad importante en el frontend (181 code smells). Esto refuerza el dictamen </w:t>
+      </w:r>
+      <w:r>
+        <w:rPr>
+          <w:rFonts w:ascii="Arial" w:hAnsi="Arial"/>
+          <w:b/>
+          <w:sz w:val="24"/>
+        </w:rPr>
+        <w:t>NO CERTIFICADO</w:t>
+      </w:r>
+      <w:r>
+        <w:rPr>
+          <w:rFonts w:ascii="Arial" w:hAnsi="Arial"/>
+          <w:b w:val="0"/>
+          <w:sz w:val="24"/>
+        </w:rPr>
+        <w:t>.</w:t>
       </w:r>
     </w:p>
     <w:p>

</xml_diff>

<commit_message>
EP3: agregar evidencias SonarQube al informe (imágenes) y actualizar DOCX
</commit_message>
<xml_diff>
--- a/EP3 - Informe de Certificacion - Atlas.docx
+++ b/EP3 - Informe de Certificacion - Atlas.docx
@@ -10688,6 +10688,230 @@
           <w:sz w:val="24"/>
         </w:rPr>
         <w:t>.</w:t>
+      </w:r>
+    </w:p>
+    <w:p>
+      <w:pPr>
+        <w:spacing w:line="240" w:lineRule="auto"/>
+        <w:jc w:val="center"/>
+      </w:pPr>
+      <w:r>
+        <w:rPr>
+          <w:rFonts w:ascii="Arial" w:hAnsi="Arial"/>
+          <w:b/>
+          <w:sz w:val="24"/>
+        </w:rPr>
+        <w:t>Dashboard Backend (atlas):</w:t>
+      </w:r>
+    </w:p>
+    <w:p>
+      <w:pPr>
+        <w:spacing w:line="240" w:lineRule="auto"/>
+        <w:jc w:val="center"/>
+      </w:pPr>
+      <w:r>
+        <w:rPr>
+          <w:rFonts w:ascii="Arial" w:hAnsi="Arial"/>
+          <w:b w:val="0"/>
+          <w:sz w:val="24"/>
+        </w:rPr>
+        <w:t>![Dashboard backend - atlas](Evidencias%20SonarQube/01-dashboard-backend.png)</w:t>
+      </w:r>
+    </w:p>
+    <w:p>
+      <w:pPr>
+        <w:spacing w:line="240" w:lineRule="auto"/>
+        <w:jc w:val="center"/>
+      </w:pPr>
+      <w:r>
+        <w:rPr>
+          <w:rFonts w:ascii="Arial" w:hAnsi="Arial"/>
+          <w:b/>
+          <w:sz w:val="24"/>
+        </w:rPr>
+        <w:t>Dashboard Frontend (atlas-frontend):</w:t>
+      </w:r>
+    </w:p>
+    <w:p>
+      <w:pPr>
+        <w:spacing w:line="240" w:lineRule="auto"/>
+        <w:jc w:val="center"/>
+      </w:pPr>
+      <w:r>
+        <w:rPr>
+          <w:rFonts w:ascii="Arial" w:hAnsi="Arial"/>
+          <w:b w:val="0"/>
+          <w:sz w:val="24"/>
+        </w:rPr>
+        <w:t>![Dashboard frontend - atlas-frontend](Evidencias%20SonarQube/02-dashboard-frontend.png)</w:t>
+      </w:r>
+    </w:p>
+    <w:p>
+      <w:pPr>
+        <w:spacing w:line="240" w:lineRule="auto"/>
+        <w:jc w:val="center"/>
+      </w:pPr>
+      <w:r>
+        <w:rPr>
+          <w:rFonts w:ascii="Arial" w:hAnsi="Arial"/>
+          <w:b/>
+          <w:sz w:val="24"/>
+        </w:rPr>
+        <w:t>Vulnerabilidad BLOCKER (db.js:6):</w:t>
+      </w:r>
+    </w:p>
+    <w:p>
+      <w:pPr>
+        <w:spacing w:line="240" w:lineRule="auto"/>
+        <w:jc w:val="center"/>
+      </w:pPr>
+      <w:r>
+        <w:rPr>
+          <w:rFonts w:ascii="Arial" w:hAnsi="Arial"/>
+          <w:b w:val="0"/>
+          <w:sz w:val="24"/>
+        </w:rPr>
+        <w:t>![Vulnerabilidad BLOCKER secrets:S6698 - db.js:6](Evidencias%20SonarQube/03-issues-vulnerabilidad-db.png)</w:t>
+      </w:r>
+    </w:p>
+    <w:p>
+      <w:pPr>
+        <w:spacing w:line="240" w:lineRule="auto"/>
+        <w:jc w:val="center"/>
+      </w:pPr>
+      <w:r>
+        <w:rPr>
+          <w:rFonts w:ascii="Arial" w:hAnsi="Arial"/>
+          <w:b/>
+          <w:sz w:val="24"/>
+        </w:rPr>
+        <w:t>Code Smells Backend:</w:t>
+      </w:r>
+    </w:p>
+    <w:p>
+      <w:pPr>
+        <w:spacing w:line="240" w:lineRule="auto"/>
+        <w:jc w:val="center"/>
+      </w:pPr>
+      <w:r>
+        <w:rPr>
+          <w:rFonts w:ascii="Arial" w:hAnsi="Arial"/>
+          <w:b w:val="0"/>
+          <w:sz w:val="24"/>
+        </w:rPr>
+        <w:t>![Code Smells Backend](Evidencias%20SonarQube/04-issues-code-smells-backend.png)</w:t>
+      </w:r>
+    </w:p>
+    <w:p>
+      <w:pPr>
+        <w:spacing w:line="240" w:lineRule="auto"/>
+        <w:jc w:val="center"/>
+      </w:pPr>
+      <w:r>
+        <w:rPr>
+          <w:rFonts w:ascii="Arial" w:hAnsi="Arial"/>
+          <w:b/>
+          <w:sz w:val="24"/>
+        </w:rPr>
+        <w:t>Security Hotspots:</w:t>
+      </w:r>
+    </w:p>
+    <w:p>
+      <w:pPr>
+        <w:spacing w:line="240" w:lineRule="auto"/>
+        <w:jc w:val="center"/>
+      </w:pPr>
+      <w:r>
+        <w:rPr>
+          <w:rFonts w:ascii="Arial" w:hAnsi="Arial"/>
+          <w:b w:val="0"/>
+          <w:sz w:val="24"/>
+        </w:rPr>
+        <w:t>![Security Hotspots](Evidencias%20SonarQube/05-security-hotspots.png)</w:t>
+      </w:r>
+    </w:p>
+    <w:p>
+      <w:pPr>
+        <w:spacing w:line="240" w:lineRule="auto"/>
+        <w:jc w:val="center"/>
+      </w:pPr>
+      <w:r>
+        <w:rPr>
+          <w:rFonts w:ascii="Arial" w:hAnsi="Arial"/>
+          <w:b/>
+          <w:sz w:val="24"/>
+        </w:rPr>
+        <w:t>Issues Frontend:</w:t>
+      </w:r>
+    </w:p>
+    <w:p>
+      <w:pPr>
+        <w:spacing w:line="240" w:lineRule="auto"/>
+        <w:jc w:val="center"/>
+      </w:pPr>
+      <w:r>
+        <w:rPr>
+          <w:rFonts w:ascii="Arial" w:hAnsi="Arial"/>
+          <w:b w:val="0"/>
+          <w:sz w:val="24"/>
+        </w:rPr>
+        <w:t>![Issues Frontend](Evidencias%20SonarQube/06-issues-frontend.png)</w:t>
+      </w:r>
+    </w:p>
+    <w:p>
+      <w:pPr>
+        <w:spacing w:line="240" w:lineRule="auto"/>
+        <w:jc w:val="center"/>
+      </w:pPr>
+      <w:r>
+        <w:rPr>
+          <w:rFonts w:ascii="Arial" w:hAnsi="Arial"/>
+          <w:b/>
+          <w:sz w:val="24"/>
+        </w:rPr>
+        <w:t>Quality Gate (Sonar way):</w:t>
+      </w:r>
+    </w:p>
+    <w:p>
+      <w:pPr>
+        <w:spacing w:line="240" w:lineRule="auto"/>
+        <w:jc w:val="center"/>
+      </w:pPr>
+      <w:r>
+        <w:rPr>
+          <w:rFonts w:ascii="Arial" w:hAnsi="Arial"/>
+          <w:b w:val="0"/>
+          <w:sz w:val="24"/>
+        </w:rPr>
+        <w:t>![Quality Gate Sonar way](Evidencias%20SonarQube/07-quality-gate.png)</w:t>
+      </w:r>
+    </w:p>
+    <w:p>
+      <w:pPr>
+        <w:spacing w:line="240" w:lineRule="auto"/>
+        <w:jc w:val="center"/>
+      </w:pPr>
+      <w:r>
+        <w:rPr>
+          <w:rFonts w:ascii="Arial" w:hAnsi="Arial"/>
+          <w:b/>
+          <w:sz w:val="24"/>
+        </w:rPr>
+        <w:t>Resumen de Proyectos:</w:t>
+      </w:r>
+    </w:p>
+    <w:p>
+      <w:pPr>
+        <w:spacing w:line="240" w:lineRule="auto"/>
+        <w:jc w:val="center"/>
+      </w:pPr>
+      <w:r>
+        <w:rPr>
+          <w:rFonts w:ascii="Arial" w:hAnsi="Arial"/>
+          <w:b w:val="0"/>
+          <w:sz w:val="24"/>
+        </w:rPr>
+        <w:t>![Proyectos en SonarQube](Evidencias%20SonarQube/08-projects-overview.png)</w:t>
       </w:r>
     </w:p>
     <w:p>

</xml_diff>